<commit_message>
Coluna 1 sintetizada; parêntesis retos → curvos nas referências
</commit_message>
<xml_diff>
--- a/tabela_art6_art7_comparativo.docx
+++ b/tabela_art6_art7_comparativo.docx
@@ -162,9 +162,11 @@
                 <w:rFonts w:ascii="Arial" w:hAnsi="Arial"/>
                 <w:sz w:val="17"/>
               </w:rPr>
-              <w:t>al. (a) — Água e alimentação:</w:t>
+              <w:t>al. (a) — Água e alimentação</w:t>
               <w:br/>
-              <w:t>Fornecimento de água e alimentos de qualidade e em quantidade adequadas (nutrição e hidratação)</w:t>
+              <w:t>Fornecimento adequado de água e alimentos</w:t>
+              <w:br/>
+              <w:t>(nutrição e hidratação)</w:t>
             </w:r>
           </w:p>
         </w:tc>
@@ -184,7 +186,7 @@
               </w:rPr>
               <w:t>Os cães e gatos recebem água e alimentos de qualidade e numa quantidade que assegura a sua boa e adequada nutrição e hidratação.</w:t>
               <w:br/>
-              <w:t>[al. (a) do art.º 6.º]</w:t>
+              <w:t>(al. (a) do art.º 6.º)</w:t>
             </w:r>
           </w:p>
         </w:tc>
@@ -248,9 +250,11 @@
                 <w:rFonts w:ascii="Arial" w:hAnsi="Arial"/>
                 <w:sz w:val="17"/>
               </w:rPr>
-              <w:t>al. (b) — Ambiente físico [1/2]:</w:t>
+              <w:t>al. (b) — Ambiente físico (1/2)</w:t>
               <w:br/>
-              <w:t>Ambiente adequado, regularmente limpo, seguro e confortável (espaço, qualidade do ar, temperatura, iluminação, proteção climática)</w:t>
+              <w:t>Limpo, seguro e confortável</w:t>
+              <w:br/>
+              <w:t>(espaço, ar, temperatura, luz, clima)</w:t>
             </w:r>
           </w:p>
         </w:tc>
@@ -270,7 +274,7 @@
               </w:rPr>
               <w:t>Os cães e gatos são mantidos num ambiente físico adequado, regularmente limpo, seguro e confortável, especialmente em termos de espaço, qualidade do ar, temperatura, iluminação e proteção face a condições climáticas adversas.</w:t>
               <w:br/>
-              <w:t>[al. (b) do art.º 6.º]</w:t>
+              <w:t>(al. (b) do art.º 6.º)</w:t>
             </w:r>
           </w:p>
         </w:tc>
@@ -332,9 +336,11 @@
                 <w:rFonts w:ascii="Arial" w:hAnsi="Arial"/>
                 <w:sz w:val="17"/>
               </w:rPr>
-              <w:t>al. (b) — Ambiente físico [2/2]:</w:t>
+              <w:t>al. (b) — Ambiente físico (2/2)</w:t>
               <w:br/>
-              <w:t>Espaço suficiente para impedir sobrelotação e garantir liberdade de movimentos</w:t>
+              <w:t>Espaço anti-sobrelotação;</w:t>
+              <w:br/>
+              <w:t>liberdade de movimentos</w:t>
             </w:r>
           </w:p>
         </w:tc>
@@ -354,7 +360,7 @@
               </w:rPr>
               <w:t>Os cães e gatos são mantidos num espaço suficientemente grande para prevenir a sobrelotação e garantir a facilidade de movimentação.</w:t>
               <w:br/>
-              <w:t>[al. (b) do art.º 6.º]</w:t>
+              <w:t>(al. (b) do art.º 6.º)</w:t>
             </w:r>
           </w:p>
         </w:tc>
@@ -416,9 +422,11 @@
                 <w:rFonts w:ascii="Arial" w:hAnsi="Arial"/>
                 <w:sz w:val="17"/>
               </w:rPr>
-              <w:t>al. (c) — Saúde e higiene [1/2]:</w:t>
+              <w:t>al. (c) — Saúde e higiene (1/2)</w:t>
               <w:br/>
-              <w:t>Animais mantidos em segurança, limpos e com boa saúde; prevenção de doenças, lesões e dor</w:t>
+              <w:t>Segurança, limpeza, boa saúde;</w:t>
+              <w:br/>
+              <w:t>prevenção de doenças, lesões e dor</w:t>
             </w:r>
           </w:p>
         </w:tc>
@@ -438,7 +446,7 @@
               </w:rPr>
               <w:t>Os cães e gatos são mantidos seguros, limpos e com boa saúde, prevenindo doenças, lesões e dor.</w:t>
               <w:br/>
-              <w:t>[al. (c) do art.º 6.º]</w:t>
+              <w:t>(al. (c) do art.º 6.º)</w:t>
             </w:r>
           </w:p>
         </w:tc>
@@ -504,9 +512,11 @@
                 <w:rFonts w:ascii="Arial" w:hAnsi="Arial"/>
                 <w:sz w:val="17"/>
               </w:rPr>
-              <w:t>al. (c) — Saúde e higiene [2/2]:</w:t>
+              <w:t>al. (c) — Saúde e higiene (2/2)</w:t>
               <w:br/>
-              <w:t>Prevenção de doenças, lesões e dor através de práticas de maneio, manuseamento e reprodução</w:t>
+              <w:t>Prevenção via maneio, manuseamento</w:t>
+              <w:br/>
+              <w:t>e reprodução adequados</w:t>
             </w:r>
           </w:p>
         </w:tc>
@@ -526,7 +536,7 @@
               </w:rPr>
               <w:t>Prevenção de doenças, lesões e dor, nomeadamente através de práticas de maneio, manuseamento e reprodução adequadas.</w:t>
               <w:br/>
-              <w:t>[al. (c) do art.º 6.º]</w:t>
+              <w:t>(al. (c) do art.º 6.º)</w:t>
             </w:r>
           </w:p>
         </w:tc>
@@ -590,9 +600,11 @@
                 <w:rFonts w:ascii="Arial" w:hAnsi="Arial"/>
                 <w:sz w:val="17"/>
               </w:rPr>
-              <w:t>al. (d) — Comportamento [1/2]:</w:t>
+              <w:t>al. (d) — Comportamento (1/2)</w:t>
               <w:br/>
-              <w:t>Ambiente que permita exibir comportamentos específicos da espécie e comportamentos sociais não nocivos</w:t>
+              <w:t>Expressão de comportamentos da espécie</w:t>
+              <w:br/>
+              <w:t>e sociais não nocivos</w:t>
             </w:r>
           </w:p>
         </w:tc>
@@ -612,7 +624,7 @@
               </w:rPr>
               <w:t>Os cães e gatos são mantidos num ambiente que lhes permite exibir comportamentos específicos da espécie e comportamentos sociais não nocivos.</w:t>
               <w:br/>
-              <w:t>[al. (d) do art.º 6.º]</w:t>
+              <w:t>(al. (d) do art.º 6.º)</w:t>
             </w:r>
           </w:p>
         </w:tc>
@@ -676,9 +688,9 @@
                 <w:rFonts w:ascii="Arial" w:hAnsi="Arial"/>
                 <w:sz w:val="17"/>
               </w:rPr>
-              <w:t>al. (d) — Comportamento [2/2]:</w:t>
+              <w:t>al. (d) — Comportamento (2/2)</w:t>
               <w:br/>
-              <w:t>Ambiente que permita estabelecer uma relação positiva com os seres humanos</w:t>
+              <w:t>Relação positiva com os seres humanos</w:t>
             </w:r>
           </w:p>
         </w:tc>
@@ -698,7 +710,7 @@
               </w:rPr>
               <w:t>Os cães e gatos são mantidos num ambiente que lhes permite estabelecer uma relação positiva com os seres humanos.</w:t>
               <w:br/>
-              <w:t>[al. (d) do art.º 6.º]</w:t>
+              <w:t>(al. (d) do art.º 6.º)</w:t>
             </w:r>
           </w:p>
         </w:tc>
@@ -760,9 +772,11 @@
                 <w:rFonts w:ascii="Arial" w:hAnsi="Arial"/>
                 <w:sz w:val="17"/>
               </w:rPr>
-              <w:t>al. (e) — Estado mental [1/4]:</w:t>
+              <w:t>al. (e) — Estado mental (1/4)</w:t>
               <w:br/>
-              <w:t>Prevenção ou redução de estímulos negativos em duração e intensidade</w:t>
+              <w:t>Prevenir/reduzir estímulos negativos</w:t>
+              <w:br/>
+              <w:t>(duração e intensidade)</w:t>
             </w:r>
           </w:p>
         </w:tc>
@@ -782,7 +796,7 @@
               </w:rPr>
               <w:t>Os cães e gatos são mantidos de forma a otimizar o seu estado mental, prevenindo ou reduzindo estímulos negativos em duração e intensidade.</w:t>
               <w:br/>
-              <w:t>[al. (e) do art.º 6.º]</w:t>
+              <w:t>(al. (e) do art.º 6.º)</w:t>
             </w:r>
           </w:p>
         </w:tc>
@@ -844,9 +858,11 @@
                 <w:rFonts w:ascii="Arial" w:hAnsi="Arial"/>
                 <w:sz w:val="17"/>
               </w:rPr>
-              <w:t>al. (e) — Estado mental [2/4]:</w:t>
+              <w:t>al. (e) — Estado mental (2/4)</w:t>
               <w:br/>
-              <w:t>Maximização de oportunidades de estímulos positivos em duração e intensidade</w:t>
+              <w:t>Maximizar estímulos positivos</w:t>
+              <w:br/>
+              <w:t>(duração e intensidade)</w:t>
             </w:r>
           </w:p>
         </w:tc>
@@ -866,7 +882,7 @@
               </w:rPr>
               <w:t>Os cães e gatos são mantidos de forma a maximizar oportunidades para estímulos positivos em duração e intensidade.</w:t>
               <w:br/>
-              <w:t>[al. (e) do art.º 6.º]</w:t>
+              <w:t>(al. (e) do art.º 6.º)</w:t>
             </w:r>
           </w:p>
         </w:tc>
@@ -926,9 +942,11 @@
                 <w:rFonts w:ascii="Arial" w:hAnsi="Arial"/>
                 <w:sz w:val="17"/>
               </w:rPr>
-              <w:t>al. (e) — Estado mental [3/4]:</w:t>
+              <w:t>al. (e) — Estado mental (3/4)</w:t>
               <w:br/>
-              <w:t>Prevenção do desenvolvimento de comportamentos repetitivos anormais ou outros indicativos de bem-estar negativo</w:t>
+              <w:t>Prevenir comportamentos repetitivos anormais</w:t>
+              <w:br/>
+              <w:t>ou indicativos de bem-estar negativo</w:t>
             </w:r>
           </w:p>
         </w:tc>
@@ -948,7 +966,7 @@
               </w:rPr>
               <w:t>Os cães e gatos são mantidos de forma a prevenir o desenvolvimento de comportamentos repetitivos anormais ou outros comportamentos indicativos de bem-estar negativo.</w:t>
               <w:br/>
-              <w:t>[al. (e) do art.º 6.º]</w:t>
+              <w:t>(al. (e) do art.º 6.º)</w:t>
             </w:r>
           </w:p>
         </w:tc>
@@ -1006,9 +1024,11 @@
                 <w:rFonts w:ascii="Arial" w:hAnsi="Arial"/>
                 <w:sz w:val="17"/>
               </w:rPr>
-              <w:t>al. (e) — Estado mental [4/4]:</w:t>
+              <w:t>al. (e) — Estado mental (4/4)</w:t>
               <w:br/>
-              <w:t>Tomar em consideração as necessidades individuais do animal nos domínios das alíneas (a) a (d)</w:t>
+              <w:t>Necessidades individuais do animal</w:t>
+              <w:br/>
+              <w:t>(als. (a) a (d))</w:t>
             </w:r>
           </w:p>
         </w:tc>
@@ -1028,7 +1048,7 @@
               </w:rPr>
               <w:t>Os cães e gatos são mantidos tendo em conta as necessidades individuais do animal nos domínios referidos nas alíneas (a) a (d).</w:t>
               <w:br/>
-              <w:t>[al. (e) do art.º 6.º]</w:t>
+              <w:t>(al. (e) do art.º 6.º)</w:t>
             </w:r>
           </w:p>
         </w:tc>
@@ -1194,9 +1214,11 @@
                 <w:rFonts w:ascii="Arial" w:hAnsi="Arial"/>
                 <w:sz w:val="17"/>
               </w:rPr>
-              <w:t>n.º 1 — Responsabilidade geral do operador:</w:t>
+              <w:t>n.º 1 — Responsabilidade geral</w:t>
               <w:br/>
-              <w:t>Responsabilidade pelo bem-estar dos animais detidos e dever de minimizar riscos</w:t>
+              <w:t>Bem-estar dos animais;</w:t>
+              <w:br/>
+              <w:t>minimizar riscos</w:t>
             </w:r>
           </w:p>
         </w:tc>
@@ -1216,7 +1238,7 @@
               </w:rPr>
               <w:t>Os operadores são responsáveis pelo bem-estar dos cães e gatos detidos nos estabelecimentos sob a sua responsabilidade e controlo, devendo minimizar quaisquer riscos para o bem-estar desses animais.</w:t>
               <w:br/>
-              <w:t>[n.º 1 do art.º 7.º]</w:t>
+              <w:t>(n.º 1 do art.º 7.º)</w:t>
             </w:r>
           </w:p>
         </w:tc>
@@ -1282,9 +1304,11 @@
                 <w:rFonts w:ascii="Arial" w:hAnsi="Arial"/>
                 <w:sz w:val="17"/>
               </w:rPr>
-              <w:t>n.º 2 — Famílias de acolhimento [1/2]:</w:t>
+              <w:t>n.º 2 — Famílias de acolhimento (1/2)</w:t>
               <w:br/>
-              <w:t>Responsabilidade jurídica recai sobre o operador; dever de informar a família sobre obrigações de bem-estar</w:t>
+              <w:t>Responsabilidade do operador;</w:t>
+              <w:br/>
+              <w:t>informação sobre bem-estar e necessidades individuais</w:t>
             </w:r>
           </w:p>
         </w:tc>
@@ -1304,7 +1328,7 @@
               </w:rPr>
               <w:t>No caso das famílias de acolhimento, a responsabilidade incumbe ao operador em cujo nome os cães ou gatos são detidos. O operador presta à família informações adequadas sobre as obrigações de bem-estar e as necessidades individuais dos animais.</w:t>
               <w:br/>
-              <w:t>[n.º 2 do art.º 7.º]</w:t>
+              <w:t>(n.º 2 do art.º 7.º)</w:t>
             </w:r>
           </w:p>
         </w:tc>
@@ -1368,9 +1392,11 @@
                 <w:rFonts w:ascii="Arial" w:hAnsi="Arial"/>
                 <w:sz w:val="17"/>
               </w:rPr>
-              <w:t>n.º 2 — Famílias de acolhimento [2/2]:</w:t>
+              <w:t>n.º 2 — Famílias de acolhimento (2/2)</w:t>
               <w:br/>
-              <w:t>Limite máximo de 5 cães ou gatos (ou 1 ninhada, com ou sem mãe) por família de acolhimento</w:t>
+              <w:t>Máx. 5 animais ou 1 ninhada</w:t>
+              <w:br/>
+              <w:t>(com/sem mãe) por família</w:t>
             </w:r>
           </w:p>
         </w:tc>
@@ -1390,7 +1416,7 @@
               </w:rPr>
               <w:t>Os operadores não colocam mais do que um total combinado de cinco cães ou gatos ou uma ninhada, com ou sem a mãe, numa família de acolhimento em qualquer momento.</w:t>
               <w:br/>
-              <w:t>[n.º 2 do art.º 7.º]</w:t>
+              <w:t>(n.º 2 do art.º 7.º)</w:t>
             </w:r>
           </w:p>
         </w:tc>
@@ -1448,9 +1474,11 @@
                 <w:rFonts w:ascii="Arial" w:hAnsi="Arial"/>
                 <w:sz w:val="17"/>
               </w:rPr>
-              <w:t>n.º 3 — Derrogação dos Estados-Membros:</w:t>
+              <w:t>n.º 3 — Derrogação (Estados-Membros)</w:t>
               <w:br/>
-              <w:t>Permissão de maior número de animais em famílias de acolhimento com espaço e cuidadores suficientes</w:t>
+              <w:t>Maior número autorizado</w:t>
+              <w:br/>
+              <w:t>se espaço e cuidadores suficientes</w:t>
             </w:r>
           </w:p>
         </w:tc>
@@ -1470,7 +1498,7 @@
               </w:rPr>
               <w:t>O Estado-Membro pode autorizar maior número de cães, gatos ou ninhadas na família de acolhimento, desde que as instalações disponham de espaço suficiente (incluindo exterior) e o número de cuidadores seja suficiente.</w:t>
               <w:br/>
-              <w:t>[n.º 3 do art.º 7.º]</w:t>
+              <w:t>(n.º 3 do art.º 7.º)</w:t>
             </w:r>
           </w:p>
         </w:tc>
@@ -1526,9 +1554,11 @@
                 <w:rFonts w:ascii="Arial" w:hAnsi="Arial"/>
                 <w:sz w:val="17"/>
               </w:rPr>
-              <w:t>n.º 4 — Proibição de crueldade, abusos e maus-tratos:</w:t>
+              <w:t>n.º 4 — Proibição de crueldade e maus-tratos</w:t>
               <w:br/>
-              <w:t>Os operadores não sujeitam qualquer cão ou gato a crueldade, abusos ou maus-tratos, incluindo por participação em atividades que resultem em crueldade</w:t>
+              <w:t>Inclui participação</w:t>
+              <w:br/>
+              <w:t>em atividades de crueldade</w:t>
             </w:r>
           </w:p>
         </w:tc>
@@ -1548,7 +1578,7 @@
               </w:rPr>
               <w:t>Os operadores não sujeitam qualquer cão ou gato a crueldade, abusos ou maus-tratos, incluindo fazendo-os participar em atividades suscetíveis de resultar em crueldade, abusos ou maus-tratos.</w:t>
               <w:br/>
-              <w:t>[n.º 4 do art.º 7.º]</w:t>
+              <w:t>(n.º 4 do art.º 7.º)</w:t>
             </w:r>
           </w:p>
         </w:tc>
@@ -1614,9 +1644,7 @@
                 <w:rFonts w:ascii="Arial" w:hAnsi="Arial"/>
                 <w:sz w:val="17"/>
               </w:rPr>
-              <w:t>n.º 5 — Proibição de abandono:</w:t>
-              <w:br/>
-              <w:t>Os operadores não abandonam os cães ou gatos criados ou detidos por eles</w:t>
+              <w:t>n.º 5 — Proibição de abandono</w:t>
             </w:r>
           </w:p>
         </w:tc>
@@ -1636,7 +1664,7 @@
               </w:rPr>
               <w:t>Os operadores não abandonam os cães ou gatos criados ou detidos por eles.</w:t>
               <w:br/>
-              <w:t>[n.º 5 do art.º 7.º]</w:t>
+              <w:t>(n.º 5 do art.º 7.º)</w:t>
             </w:r>
           </w:p>
         </w:tc>
@@ -1698,9 +1726,11 @@
                 <w:rFonts w:ascii="Arial" w:hAnsi="Arial"/>
                 <w:sz w:val="17"/>
               </w:rPr>
-              <w:t>n.º 6 — Realojamento ao cessar atividade:</w:t>
+              <w:t>n.º 6 — Realojamento ao cessar atividade</w:t>
               <w:br/>
-              <w:t>Antes de cessar as atividades, o operador assegura que todos os animais são realojados (adoção própria ou transferência para outros operadores/adquirentes)</w:t>
+              <w:t>Adoção ou transferência</w:t>
+              <w:br/>
+              <w:t>para outros operadores/adquirentes</w:t>
             </w:r>
           </w:p>
         </w:tc>
@@ -1720,7 +1750,7 @@
               </w:rPr>
               <w:t>Antes de os operadores cessarem as atividades num estabelecimento, asseguram que os cães ou gatos aí detidos são realojados, seja assumindo eles próprios a propriedade de animal de companhia, seja transferindo a responsabilidade para outros operadores ou adquirentes.</w:t>
               <w:br/>
-              <w:t>[n.º 6 do art.º 7.º]</w:t>
+              <w:t>(n.º 6 do art.º 7.º)</w:t>
             </w:r>
           </w:p>
         </w:tc>
@@ -1778,9 +1808,9 @@
                 <w:rFonts w:ascii="Arial" w:hAnsi="Arial"/>
                 <w:sz w:val="17"/>
               </w:rPr>
-              <w:t>n.º 7 — Número suficiente de cuidadores:</w:t>
+              <w:t>n.º 7 — Cuidadores suficientes e competentes</w:t>
               <w:br/>
-              <w:t>Os operadores asseguram um número suficiente de cuidadores com as competências exigidas no art.º 12.º</w:t>
+              <w:t>(competências do art.º 12.º)</w:t>
             </w:r>
           </w:p>
         </w:tc>
@@ -1800,7 +1830,7 @@
               </w:rPr>
               <w:t>Os operadores asseguram que os cães e gatos são manuseados por um número suficiente de cuidadores de animais para satisfazer as necessidades de bem-estar, e que esses cuidadores possuem as competências exigidas no artigo 12.º.</w:t>
               <w:br/>
-              <w:t>[n.º 7 do art.º 7.º]</w:t>
+              <w:t>(n.º 7 do art.º 7.º)</w:t>
             </w:r>
           </w:p>
         </w:tc>
@@ -1858,9 +1888,11 @@
                 <w:rFonts w:ascii="Arial" w:hAnsi="Arial"/>
                 <w:sz w:val="17"/>
               </w:rPr>
-              <w:t>n.º 8 — Monitorização de indicadores:</w:t>
+              <w:t>n.º 8 — Monitorização de indicadores</w:t>
               <w:br/>
-              <w:t>Os operadores monitorizam indicadores baseados nos animais (comportamento e aparência física) e adotam ações com base nos resultados; atos delegados definirão os indicadores e métodos</w:t>
+              <w:t>Comportamento e aparência física;</w:t>
+              <w:br/>
+              <w:t>ações baseadas em resultados</w:t>
             </w:r>
           </w:p>
         </w:tc>
@@ -1882,7 +1914,7 @@
               <w:br/>
               <w:t>A Comissão adotará atos delegados que estabelecerão os indicadores e os métodos de medição.</w:t>
               <w:br/>
-              <w:t>[n.ºs 8 e 9 do art.º 7.º]</w:t>
+              <w:t>(n.ºs 8 e 9 do art.º 7.º)</w:t>
             </w:r>
           </w:p>
         </w:tc>

</xml_diff>

<commit_message>
Corrigir omissões na tabela arts. 6-7: adicionar arts. 46/51 (alimentação), 13/14/47/48 (alojamento/ambiente), 52 (maneio) em todas as colunas pertinentes
</commit_message>
<xml_diff>
--- a/tabela_art6_art7_comparativo.docx
+++ b/tabela_art6_art7_comparativo.docx
@@ -208,6 +208,10 @@
               <w:br/>
               <w:t>Art.º 10.º, n.º 1, al. a), ii) — alimentos saudáveis, adequados e convenientes; acesso permanente a água potável.</w:t>
               <w:br/>
+              <w:t>Art.º 51.º, n.º 1 — programa de alimentação bem definido, de valor nutritivo adequado, em quantidade suficiente para as necessidades das espécies e dos indivíduos.</w:t>
+              <w:br/>
+              <w:t>Art.º 51.º, n.º 6 — acesso a água potável sem restrição (salvo razões médico-veterinárias).</w:t>
+              <w:br/>
               <w:t>Coberto.</w:t>
             </w:r>
           </w:p>
@@ -228,9 +232,11 @@
               </w:rPr>
               <w:t>Art.º 4.º — dever de assegurar as necessidades básicas de bem-estar.</w:t>
               <w:br/>
-              <w:t>Art.º 5.º, n.º 1 — condições de detenção e alojamento devem salvaguardar os parâmetros de bem-estar.</w:t>
+              <w:t>Art.º 46.º, n.º 1 — programa de alimentação bem definido, de valor nutritivo adequado, em quantidade suficiente para as necessidades das espécies e dos indivíduos (nos locais de criação, manutenção, venda, centros de recolha e hospedagem).</w:t>
               <w:br/>
-              <w:t>Sem correspondência explícita a alimentação e hidratação como norma autónoma.</w:t>
+              <w:t>Art.º 46.º, n.º 6 — acesso a água potável sem restrição (salvo razões médico-veterinárias).</w:t>
+              <w:br/>
+              <w:t>Coberto no âmbito de estabelecimentos (art.º 46.º não se aplica à detenção doméstica individual).</w:t>
             </w:r>
           </w:p>
         </w:tc>
@@ -296,7 +302,11 @@
               <w:br/>
               <w:t>Art.º 10.º, n.º 1, al. a), v) — abrigo adequado com proteção de condições atmosféricas adversas (frio, chuva, sol ou calor excessivos); cama seca, limpa e confortável.</w:t>
               <w:br/>
-              <w:t>Parcialmente coberto (sem referência explícita a qualidade do ar ou iluminação).</w:t>
+              <w:t>Art.º 48.º, n.º 1 — temperatura, ventilação, luminosidade e obscuridade adequadas à manutenção do bem-estar e conforto das espécies.</w:t>
+              <w:br/>
+              <w:t>Art.º 48.º, n.º 3 — luz preferencialmente natural; luz artificial o mais próxima do espectro solar.</w:t>
+              <w:br/>
+              <w:t>Parcialmente coberto (sem referência explícita a qualidade do ar como parâmetro distinto da ventilação).</w:t>
             </w:r>
           </w:p>
         </w:tc>
@@ -316,7 +326,11 @@
               </w:rPr>
               <w:t>Art.º 5.º, n.º 1 — condições de detenção devem salvaguardar bem-estar.</w:t>
               <w:br/>
-              <w:t>Sem enumeração explícita dos parâmetros físicos (ar, temperatura, luz).</w:t>
+              <w:t>Art.º 14.º, n.º 1 — temperatura, ventilação, luminosidade e obscuridade das instalações adequadas ao bem-estar das espécies.</w:t>
+              <w:br/>
+              <w:t>Art.º 14.º, n.º 3 — luz preferencialmente natural; artificial o mais próxima do espectro solar.</w:t>
+              <w:br/>
+              <w:t>Parcialmente coberto (sem referência explícita a qualidade do ar como parâmetro distinto da ventilação).</w:t>
             </w:r>
           </w:p>
         </w:tc>
@@ -380,6 +394,8 @@
               </w:rPr>
               <w:t>Art.º 10.º, n.º 1, al. a), iv) — liberdade de movimento; proibição de contenção permanente; espaço e enriquecimento ambiental adequados.</w:t>
               <w:br/>
+              <w:t>Art.º 47.º, n.º 1 — espaço adequado às necessidades fisiológicas e etológicas; prática de exercício físico; fuga de animais agressores.</w:t>
+              <w:br/>
               <w:t>Portaria prevista no art.º 58.º fixará requisitos específicos.</w:t>
               <w:br/>
               <w:t>Parcialmente coberto (sobrelotação não referenciada de forma autónoma).</w:t>
@@ -402,7 +418,9 @@
               </w:rPr>
               <w:t>Art.º 5.º, n.º 3, al. b) — proibição de restringir a liberdade de movimentos de forma a impedir levantar-se, deitar-se ou virar-se sobre si próprios.</w:t>
               <w:br/>
-              <w:t>Sem norma sobre sobrelotação.</w:t>
+              <w:t>Art.º 13.º, n.º 1, als. a) e b) — espaço adequado às necessidades fisiológicas e etológicas; prática de exercício físico; fuga de animais agressores.</w:t>
+              <w:br/>
+              <w:t>Parcialmente coberto (sobrelotação não referenciada de forma autónoma).</w:t>
             </w:r>
           </w:p>
         </w:tc>
@@ -470,6 +488,8 @@
               <w:br/>
               <w:t>Art.º 10.º, n.º 1, al. f) — tratamento veterinário preventivo, paliativo ou curativo.</w:t>
               <w:br/>
+              <w:t>Art.º 52.º, n.º 2 — todos os animais alvo de inspeção no início e final do dia e a cada quatro horas; primeiros cuidados imediatos a animais doentes ou lesionados.</w:t>
+              <w:br/>
               <w:t>Coberto.</w:t>
             </w:r>
           </w:p>
@@ -492,7 +512,9 @@
               <w:br/>
               <w:t>Art.º 6.º — dever de assegurar cuidados médico-veterinários ao animal ferido ou doente.</w:t>
               <w:br/>
-              <w:t>Coberto em termos gerais.</w:t>
+              <w:t>Art.º 47.º, n.º 3 — inspeção diária de todos os animais; primeiros cuidados imediatos a animais doentes, lesionados ou com alterações comportamentais.</w:t>
+              <w:br/>
+              <w:t>Coberto em termos gerais (inspeção diária; sem diferenciação de frequência para animais vulneráveis).</w:t>
             </w:r>
           </w:p>
         </w:tc>
@@ -556,9 +578,11 @@
               </w:rPr>
               <w:t>Art.º 12.º, n.º 1, al. b) — proibição de práticas que causem sofrimento, dano, stresse ou angústia.</w:t>
               <w:br/>
+              <w:t>Art.º 52.º, n.ºs 3 e 5 — maneio feito de forma a não causar dores, sofrimento ou distúrbios desnecessários; meios de contenção não devem causar ferimentos, dores ou angústia.</w:t>
+              <w:br/>
               <w:t>Art.º 70.º (normas reprodutivas) — limitações à reprodução para proteção da saúde.</w:t>
               <w:br/>
-              <w:t>Coberto de forma dispersa.</w:t>
+              <w:t>Coberto.</w:t>
             </w:r>
           </w:p>
         </w:tc>
@@ -578,9 +602,11 @@
               </w:rPr>
               <w:t>Art.º 5.º, n.º 3, al. c) — proibição de usar equipamentos de maneio, contenção ou treino que causem sofrimento desnecessário ou lesões.</w:t>
               <w:br/>
+              <w:t>Art.º 47.º, n.ºs 4 e 5 — manuseamento feito de forma a não causar dores, sofrimento ou distúrbios desnecessários; meios de contenção não devem causar ferimentos, dores ou angústia.</w:t>
+              <w:br/>
               <w:t>Art.º 8.º, n.º 1 e 2 — reprodução planeada e parâmetros reprodutivos.</w:t>
               <w:br/>
-              <w:t>Coberto de forma dispersa.</w:t>
+              <w:t>Coberto.</w:t>
             </w:r>
           </w:p>
         </w:tc>
@@ -648,6 +674,8 @@
               <w:br/>
               <w:t>Art.º 10.º, n.º 1, al. a), vi) — contato social adequado à espécie, de acordo com a idade e atividade.</w:t>
               <w:br/>
+              <w:t>Art.º 47.º, n.º 4 — enriquecimento ambiental complexo e estimulante com materiais e equipamento que estimulem a expressão do repertório de comportamentos naturais.</w:t>
+              <w:br/>
               <w:t>Coberto.</w:t>
             </w:r>
           </w:p>
@@ -666,9 +694,11 @@
                 <w:rFonts w:ascii="Arial" w:hAnsi="Arial"/>
                 <w:sz w:val="17"/>
               </w:rPr>
-              <w:t>Art.º 5.º, n.º 1 — condições de detenção que salvaguardem parâmetros de bem-estar (sem menção explícita a comportamentos específicos da espécie).</w:t>
+              <w:t>Art.º 5.º, n.º 1 — condições de detenção que salvaguardem parâmetros de bem-estar.</w:t>
               <w:br/>
-              <w:t>Não coberto de forma explícita.</w:t>
+              <w:t>Art.º 13.º, n.º 5 — instalações equipadas com materiais e equipamento que estimulem a expressão dos comportamentos naturais (substrato, cama, ninhos, ramos, buracos, locais para banhos).</w:t>
+              <w:br/>
+              <w:t>Parcialmente coberto (enriquecimento ambiental para comportamentos naturais; sem referência explícita a comportamentos sociais não nocivos).</w:t>
             </w:r>
           </w:p>
         </w:tc>
@@ -730,6 +760,8 @@
               </w:rPr>
               <w:t>Art.º 10.º, n.º 1, al. c) — dever de educar o animal com recurso a métodos de reforço positivo visando a sua vinculação e integração positivas no espaço familiar e no meio ambiente.</w:t>
               <w:br/>
+              <w:t>Art.º 52.º, n.º 4 — interações do pessoal técnico com os animais devem ser positivas, regulares, previsíveis e não forçadas.</w:t>
+              <w:br/>
               <w:t>Coberto.</w:t>
             </w:r>
           </w:p>
@@ -752,7 +784,7 @@
               <w:br/>
               <w:t>Art.º 7.º, n.º 2 — treino de acordo com boas práticas.</w:t>
               <w:br/>
-              <w:t>Parcialmente coberto (apenas cães; sem referência explícita a relação positiva).</w:t>
+              <w:t>Parcialmente coberto (apenas cães; sem referência explícita a relação positiva com os seres humanos como fim autónomo).</w:t>
             </w:r>
           </w:p>
         </w:tc>
@@ -838,7 +870,7 @@
               </w:rPr>
               <w:t>Art.º 5.º, n.º 3 — proibição de violência e sofrimento.</w:t>
               <w:br/>
-              <w:t>Sem referência explícita à gestão de estímulos negativos.</w:t>
+              <w:t>Sem referência explícita à gestão ativa de estímulos negativos.</w:t>
             </w:r>
           </w:p>
         </w:tc>
@@ -902,6 +934,8 @@
               </w:rPr>
               <w:t>Art.º 10.º, n.º 1, al. a), i) — dever de proporcionar atenção, supervisão, controlo, exercício físico e estímulo mental.</w:t>
               <w:br/>
+              <w:t>Art.º 47.º, n.ºs 6 e 7 — acesso diário a área de exercício (mínimo 2×30 min); equipamento de enriquecimento ambiental e agilidade.</w:t>
+              <w:br/>
               <w:t>Parcialmente coberto.</w:t>
             </w:r>
           </w:p>
@@ -920,9 +954,9 @@
                 <w:rFonts w:ascii="Arial" w:hAnsi="Arial"/>
                 <w:sz w:val="17"/>
               </w:rPr>
-              <w:t>Art.º 5.º, n.º 4 — proibição de fins didáticos e lúdicos que causem sofrimento.</w:t>
+              <w:t>Art.º 13.º, n.º 5 — materiais e equipamento que estimulem a expressão dos comportamentos naturais.</w:t>
               <w:br/>
-              <w:t>Sem norma positiva sobre estímulos positivos.</w:t>
+              <w:t>Sem norma positiva explícita sobre maximização de estímulos positivos.</w:t>
             </w:r>
           </w:p>
         </w:tc>
@@ -984,9 +1018,9 @@
                 <w:rFonts w:ascii="Arial" w:hAnsi="Arial"/>
                 <w:sz w:val="17"/>
               </w:rPr>
-              <w:t>Não regulado explicitamente.</w:t>
+              <w:t>Não regulado explicitamente como norma autónoma.</w:t>
               <w:br/>
-              <w:t>(O art.º 7.º, n.º 1, al. d) e e) do @rgbeac indiretamente impõem condições que previnem o seu aparecimento, mas sem norma autónoma.)</w:t>
+              <w:t>(O art.º 7.º, n.º 1, al. d) e e) e o art.º 47.º do @rgbeac indiretamente impõem condições que previnem o seu aparecimento.)</w:t>
             </w:r>
           </w:p>
         </w:tc>
@@ -1068,7 +1102,9 @@
               </w:rPr>
               <w:t>Art.º 10.º, n.º 1, al. a) — bem-estar assegurado "de acordo com a sua espécie, raça, idade e necessidades físicas e etológicas".</w:t>
               <w:br/>
-              <w:t>Parcialmente coberto (necessidades da espécie/raça/idade; não explicitamente individuais).</w:t>
+              <w:t>Art.º 48.º, n.º 2 — fatores ambientais adequados às necessidades específicas de animais em fase reprodutiva, recém-nascidos ou doentes.</w:t>
+              <w:br/>
+              <w:t>Parcialmente coberto (necessidades da espécie/raça/idade/fase fisiológica; não explicitamente individuais).</w:t>
             </w:r>
           </w:p>
         </w:tc>
@@ -1087,6 +1123,10 @@
                 <w:sz w:val="17"/>
               </w:rPr>
               <w:t>Art.º 4.º — necessidades básicas de bem-estar (sem referência à individualidade do animal).</w:t>
+              <w:br/>
+              <w:t>Art.º 14.º, n.º 2 — fatores ambientais adequados às necessidades específicas de animais em fase reprodutiva, recém-nascidos ou doentes.</w:t>
+              <w:br/>
+              <w:t>Parcialmente coberto.</w:t>
             </w:r>
           </w:p>
         </w:tc>
@@ -1848,9 +1888,9 @@
                 <w:rFonts w:ascii="Arial" w:hAnsi="Arial"/>
                 <w:sz w:val="17"/>
               </w:rPr>
-              <w:t>Não regulado de forma explícita.</w:t>
+              <w:t>Art.º 52.º, n.º 1 — observação diária dos animais e maneio assegurados por pessoal técnico com formação teórica e prática específica certificada pela DGAV e em número adequado à quantidade e espécies animais alojados.</w:t>
               <w:br/>
-              <w:t>(O @rgbeac prevê deveres do detentor — art.º 10.º — mas não aborda o número de cuidadores por estabelecimento ou as suas competências técnicas específicas.)</w:t>
+              <w:t>Parcialmente coberto (número adequado e formação exigidos; sem remissão para catálogo de competências específico equivalente ao art.º 12.º do Regulamento).</w:t>
             </w:r>
           </w:p>
         </w:tc>
@@ -1868,7 +1908,11 @@
                 <w:rFonts w:ascii="Arial" w:hAnsi="Arial"/>
                 <w:sz w:val="17"/>
               </w:rPr>
-              <w:t>Não regulado (o @codigo não define "cuidador de animais" como sujeito de obrigações autónomas).</w:t>
+              <w:t>Art.º 47.º, n.º 1 — observação diária dos animais e maneio assegurados por pessoal com aptidão para o efeito e em número adequado à quantidade e espécies animais.</w:t>
+              <w:br/>
+              <w:t>Art.º 47.º, n.º 2 — maneio por pessoal com experiência ou formação adequada, sob orientação de médico veterinário.</w:t>
+              <w:br/>
+              <w:t>Parcialmente coberto (número adequado e formação exigidos; sem catálogo de competências específico equivalente ao art.º 12.º do Regulamento).</w:t>
             </w:r>
           </w:p>
         </w:tc>
@@ -1932,9 +1976,11 @@
                 <w:rFonts w:ascii="Arial" w:hAnsi="Arial"/>
                 <w:sz w:val="17"/>
               </w:rPr>
-              <w:t>Não regulado explicitamente.</w:t>
+              <w:t>Art.º 10.º, n.º 1, al. b) — dever de vigiar o animal de modo a evitar que cause danos (obrigação de vigilância; não equivale a monitorização de indicadores de bem-estar).</w:t>
               <w:br/>
-              <w:t>(O @rgbeac prevê obrigação geral de vigiar o animal — art.º 10.º, n.º 1, al. b) — mas sem sistema de indicadores formais nem obrigação de ação baseada em resultados.)</w:t>
+              <w:t>Art.º 52.º, n.º 2 — inspeção dos animais no início e final do dia e a cada quatro horas; primeiros cuidados imediatos.</w:t>
+              <w:br/>
+              <w:t>Parcialmente coberto (periodicidade de inspeção regulada; sem sistema formal de indicadores baseados nos animais nem obrigação de ação estruturada com base nos resultados).</w:t>
             </w:r>
           </w:p>
         </w:tc>
@@ -1952,9 +1998,9 @@
                 <w:rFonts w:ascii="Arial" w:hAnsi="Arial"/>
                 <w:sz w:val="17"/>
               </w:rPr>
-              <w:t>Não regulado.</w:t>
+              <w:t>Art.º 47.º, n.º 3 — inspeção diária de todos os animais; primeiros cuidados imediatos a doentes, lesionados ou com alterações comportamentais.</w:t>
               <w:br/>
-              <w:t>(O @codigo não prevê indicadores de bem-estar baseados nos animais nem obrigação de monitorização sistemática.)</w:t>
+              <w:t>Parcialmente coberto (inspeção diária; sem sistema formal de indicadores de bem-estar nem atos delegados equivalentes).</w:t>
             </w:r>
           </w:p>
         </w:tc>

</xml_diff>